<commit_message>
Section 3.1 and 3.2 - Solution 1 and 2 Class Diagrams
</commit_message>
<xml_diff>
--- a/ENSE 375 - Password Manager Project Report.docx
+++ b/ENSE 375 - Password Manager Project Report.docx
@@ -411,6 +411,7 @@
         <w:p>
           <w:pPr>
             <w:pStyle w:val="TOCHeading"/>
+            <w:ind w:hanging="0" w:left="0"/>
             <w:rPr/>
           </w:pPr>
           <w:r>
@@ -452,6 +453,11 @@
                 <w:rStyle w:val="IndexLink"/>
               </w:rPr>
               <w:t>1</w:t>
+            </w:r>
+            <w:r>
+              <w:rPr>
+                <w:rStyle w:val="IndexLink"/>
+              </w:rPr>
               <w:tab/>
               <w:t>Introduction</w:t>
               <w:tab/>
@@ -2664,21 +2670,6 @@
     </w:p>
     <w:p>
       <w:pPr>
-        <w:pStyle w:val="Normal"/>
-        <w:jc w:val="both"/>
-        <w:rPr>
-          <w:color w:themeColor="dark1" w:themeTint="80" w:val="7F7F7F"/>
-        </w:rPr>
-      </w:pPr>
-      <w:r>
-        <w:rPr>
-          <w:color w:themeColor="dark1" w:themeTint="80" w:val="7F7F7F"/>
-        </w:rPr>
-        <w:t xml:space="preserve">In this section, you will provide an account of some solutions your team brainstormed to implement and test the project. Some solutions might not have all the desired features, some might not satisfy the constraints, or both. These solutions come up in your mind while you brainstorm ways of implementing all the features while meeting the constraints. Towards, the end you select a solution that you think has all the features, testable and satisfies all the constraints. Remember that an engineering design is iterative in nature! </w:t>
-      </w:r>
-    </w:p>
-    <w:p>
-      <w:pPr>
         <w:pStyle w:val="Heading2"/>
         <w:ind w:hanging="0" w:left="0"/>
         <w:jc w:val="left"/>
@@ -2700,16 +2691,469 @@
     <w:p>
       <w:pPr>
         <w:pStyle w:val="Normal"/>
+        <w:ind w:hanging="0" w:left="0"/>
+        <w:jc w:val="left"/>
+        <w:rPr>
+          <w:color w:themeColor="dark1" w:val="000000"/>
+        </w:rPr>
+      </w:pPr>
+      <w:r>
+        <w:rPr/>
+      </w:r>
+    </w:p>
+    <w:p>
+      <w:pPr>
+        <w:pStyle w:val="Normal"/>
+        <w:ind w:hanging="0" w:left="0"/>
+        <w:jc w:val="left"/>
+        <w:rPr>
+          <w:color w:themeColor="dark1" w:val="000000"/>
+        </w:rPr>
+      </w:pPr>
+      <w:r>
+        <w:rPr/>
+        <w:drawing>
+          <wp:anchor behindDoc="0" distT="0" distB="0" distL="0" distR="0" simplePos="0" locked="0" layoutInCell="0" allowOverlap="1" relativeHeight="3">
+            <wp:simplePos x="0" y="0"/>
+            <wp:positionH relativeFrom="column">
+              <wp:align>center</wp:align>
+            </wp:positionH>
+            <wp:positionV relativeFrom="paragraph">
+              <wp:posOffset>635</wp:posOffset>
+            </wp:positionV>
+            <wp:extent cx="5943600" cy="3346450"/>
+            <wp:effectExtent l="0" t="0" r="0" b="0"/>
+            <wp:wrapSquare wrapText="largest"/>
+            <wp:docPr id="2" name="Image1" descr=""/>
+            <wp:cNvGraphicFramePr>
+              <a:graphicFrameLocks xmlns:a="http://schemas.openxmlformats.org/drawingml/2006/main" noChangeAspect="1"/>
+            </wp:cNvGraphicFramePr>
+            <a:graphic xmlns:a="http://schemas.openxmlformats.org/drawingml/2006/main">
+              <a:graphicData uri="http://schemas.openxmlformats.org/drawingml/2006/picture">
+                <pic:pic xmlns:pic="http://schemas.openxmlformats.org/drawingml/2006/picture">
+                  <pic:nvPicPr>
+                    <pic:cNvPr id="2" name="Image1" descr=""/>
+                    <pic:cNvPicPr>
+                      <a:picLocks noChangeAspect="1" noChangeArrowheads="1"/>
+                    </pic:cNvPicPr>
+                  </pic:nvPicPr>
+                  <pic:blipFill>
+                    <a:blip r:embed="rId3"/>
+                    <a:stretch>
+                      <a:fillRect/>
+                    </a:stretch>
+                  </pic:blipFill>
+                  <pic:spPr bwMode="auto">
+                    <a:xfrm>
+                      <a:off x="0" y="0"/>
+                      <a:ext cx="5943600" cy="3346450"/>
+                    </a:xfrm>
+                    <a:prstGeom prst="rect">
+                      <a:avLst/>
+                    </a:prstGeom>
+                  </pic:spPr>
+                </pic:pic>
+              </a:graphicData>
+            </a:graphic>
+          </wp:anchor>
+        </w:drawing>
+      </w:r>
+    </w:p>
+    <w:p>
+      <w:pPr>
+        <w:pStyle w:val="BodyText"/>
+        <w:spacing w:lineRule="auto" w:line="276"/>
+        <w:ind w:hanging="0" w:left="0"/>
+        <w:jc w:val="left"/>
+        <w:rPr>
+          <w:b w:val="false"/>
+          <w:i w:val="false"/>
+          <w:caps w:val="false"/>
+          <w:smallCaps w:val="false"/>
+        </w:rPr>
+      </w:pPr>
+      <w:r>
+        <w:rPr>
+          <w:rFonts w:ascii="Aptos;Aptos_EmbeddedFont;Aptos_MSFontService;sans-serif" w:hAnsi="Aptos;Aptos_EmbeddedFont;Aptos_MSFontService;sans-serif"/>
+          <w:b w:val="false"/>
+          <w:i w:val="false"/>
+          <w:caps w:val="false"/>
+          <w:smallCaps w:val="false"/>
+          <w:sz w:val="24"/>
+          <w:lang w:val="en-US"/>
+        </w:rPr>
+        <w:t>Our first solution was designed with the MV</w:t>
+      </w:r>
+      <w:r>
+        <w:rPr>
+          <w:rFonts w:ascii="Aptos;Aptos_EmbeddedFont;Aptos_MSFontService;sans-serif" w:hAnsi="Aptos;Aptos_EmbeddedFont;Aptos_MSFontService;sans-serif"/>
+          <w:b w:val="false"/>
+          <w:i w:val="false"/>
+          <w:caps w:val="false"/>
+          <w:smallCaps w:val="false"/>
+          <w:sz w:val="24"/>
+          <w:lang w:val="en-US"/>
+        </w:rPr>
+        <w:t>P</w:t>
+      </w:r>
+      <w:r>
+        <w:rPr>
+          <w:rFonts w:ascii="Aptos;Aptos_EmbeddedFont;Aptos_MSFontService;sans-serif" w:hAnsi="Aptos;Aptos_EmbeddedFont;Aptos_MSFontService;sans-serif"/>
+          <w:b w:val="false"/>
+          <w:i w:val="false"/>
+          <w:caps w:val="false"/>
+          <w:smallCaps w:val="false"/>
+          <w:sz w:val="24"/>
+          <w:lang w:val="en-US"/>
+        </w:rPr>
+        <w:t xml:space="preserve"> (Model-View-</w:t>
+      </w:r>
+      <w:r>
+        <w:rPr>
+          <w:rFonts w:ascii="Aptos;Aptos_EmbeddedFont;Aptos_MSFontService;sans-serif" w:hAnsi="Aptos;Aptos_EmbeddedFont;Aptos_MSFontService;sans-serif"/>
+          <w:b w:val="false"/>
+          <w:i w:val="false"/>
+          <w:caps w:val="false"/>
+          <w:smallCaps w:val="false"/>
+          <w:sz w:val="24"/>
+          <w:lang w:val="en-US"/>
+        </w:rPr>
+        <w:t>Presenter</w:t>
+      </w:r>
+      <w:r>
+        <w:rPr>
+          <w:rFonts w:ascii="Aptos;Aptos_EmbeddedFont;Aptos_MSFontService;sans-serif" w:hAnsi="Aptos;Aptos_EmbeddedFont;Aptos_MSFontService;sans-serif"/>
+          <w:b w:val="false"/>
+          <w:i w:val="false"/>
+          <w:caps w:val="false"/>
+          <w:smallCaps w:val="false"/>
+          <w:sz w:val="24"/>
+          <w:lang w:val="en-US"/>
+        </w:rPr>
+        <w:t xml:space="preserve">) architecture.  Initially, we have a single </w:t>
+      </w:r>
+      <w:r>
+        <w:rPr>
+          <w:rFonts w:ascii="Aptos;Aptos_EmbeddedFont;Aptos_MSFontService;sans-serif" w:hAnsi="Aptos;Aptos_EmbeddedFont;Aptos_MSFontService;sans-serif"/>
+          <w:b/>
+          <w:i w:val="false"/>
+          <w:caps w:val="false"/>
+          <w:smallCaps w:val="false"/>
+          <w:sz w:val="24"/>
+          <w:lang w:val="en-US"/>
+        </w:rPr>
+        <w:t xml:space="preserve">LoginView </w:t>
+      </w:r>
+      <w:r>
+        <w:rPr>
+          <w:rFonts w:ascii="Aptos;Aptos_EmbeddedFont;Aptos_MSFontService;sans-serif" w:hAnsi="Aptos;Aptos_EmbeddedFont;Aptos_MSFontService;sans-serif"/>
+          <w:b w:val="false"/>
+          <w:i w:val="false"/>
+          <w:caps w:val="false"/>
+          <w:smallCaps w:val="false"/>
+          <w:sz w:val="24"/>
+          <w:lang w:val="en-US"/>
+        </w:rPr>
+        <w:t xml:space="preserve">class that handles all user interactions including the main menu, creating and deleting entries, listing entries, and prompting input. A </w:t>
+      </w:r>
+      <w:r>
+        <w:rPr>
+          <w:rFonts w:ascii="Aptos;Aptos_EmbeddedFont;Aptos_MSFontService;sans-serif" w:hAnsi="Aptos;Aptos_EmbeddedFont;Aptos_MSFontService;sans-serif"/>
+          <w:b/>
+          <w:i w:val="false"/>
+          <w:caps w:val="false"/>
+          <w:smallCaps w:val="false"/>
+          <w:sz w:val="24"/>
+          <w:lang w:val="en-US"/>
+        </w:rPr>
+        <w:t xml:space="preserve">ProgrammingController </w:t>
+      </w:r>
+      <w:r>
+        <w:rPr>
+          <w:rFonts w:ascii="Aptos;Aptos_EmbeddedFont;Aptos_MSFontService;sans-serif" w:hAnsi="Aptos;Aptos_EmbeddedFont;Aptos_MSFontService;sans-serif"/>
+          <w:b w:val="false"/>
+          <w:i w:val="false"/>
+          <w:caps w:val="false"/>
+          <w:smallCaps w:val="false"/>
+          <w:sz w:val="24"/>
+          <w:lang w:val="en-US"/>
+        </w:rPr>
+        <w:t xml:space="preserve">was placed between the View and the model. It unlocks the database, derives the primary key, created and edited logins, and generates TOTP (Time-Based One-Time Generator). In the model, it has a </w:t>
+      </w:r>
+      <w:r>
+        <w:rPr>
+          <w:rFonts w:ascii="Aptos;Aptos_EmbeddedFont;Aptos_MSFontService;sans-serif" w:hAnsi="Aptos;Aptos_EmbeddedFont;Aptos_MSFontService;sans-serif"/>
+          <w:b/>
+          <w:i w:val="false"/>
+          <w:caps w:val="false"/>
+          <w:smallCaps w:val="false"/>
+          <w:sz w:val="24"/>
+          <w:lang w:val="en-US"/>
+        </w:rPr>
+        <w:t xml:space="preserve">DatabaseManager </w:t>
+      </w:r>
+      <w:r>
+        <w:rPr>
+          <w:rFonts w:ascii="Aptos;Aptos_EmbeddedFont;Aptos_MSFontService;sans-serif" w:hAnsi="Aptos;Aptos_EmbeddedFont;Aptos_MSFontService;sans-serif"/>
+          <w:b w:val="false"/>
+          <w:i w:val="false"/>
+          <w:caps w:val="false"/>
+          <w:smallCaps w:val="false"/>
+          <w:sz w:val="24"/>
+          <w:lang w:val="en-US"/>
+        </w:rPr>
+        <w:t xml:space="preserve">for file storage, </w:t>
+      </w:r>
+      <w:r>
+        <w:rPr>
+          <w:rFonts w:ascii="Aptos;Aptos_EmbeddedFont;Aptos_MSFontService;sans-serif" w:hAnsi="Aptos;Aptos_EmbeddedFont;Aptos_MSFontService;sans-serif"/>
+          <w:b/>
+          <w:i w:val="false"/>
+          <w:caps w:val="false"/>
+          <w:smallCaps w:val="false"/>
+          <w:sz w:val="24"/>
+          <w:lang w:val="en-US"/>
+        </w:rPr>
+        <w:t>Primary key</w:t>
+      </w:r>
+      <w:r>
+        <w:rPr>
+          <w:b w:val="false"/>
+          <w:i w:val="false"/>
+          <w:caps w:val="false"/>
+          <w:smallCaps w:val="false"/>
+        </w:rPr>
+        <w:t xml:space="preserve"> </w:t>
+      </w:r>
+      <w:r>
+        <w:rPr>
+          <w:rFonts w:ascii="Aptos;Aptos_EmbeddedFont;Aptos_MSFontService;sans-serif" w:hAnsi="Aptos;Aptos_EmbeddedFont;Aptos_MSFontService;sans-serif"/>
+          <w:b w:val="false"/>
+          <w:i w:val="false"/>
+          <w:caps w:val="false"/>
+          <w:smallCaps w:val="false"/>
+          <w:sz w:val="24"/>
+          <w:lang w:val="en-US"/>
+        </w:rPr>
+        <w:t xml:space="preserve">is used for encryption and decryption. There are also other abstract classes called </w:t>
+      </w:r>
+      <w:r>
+        <w:rPr>
+          <w:rFonts w:ascii="Aptos;Aptos_EmbeddedFont;Aptos_MSFontService;sans-serif" w:hAnsi="Aptos;Aptos_EmbeddedFont;Aptos_MSFontService;sans-serif"/>
+          <w:b/>
+          <w:i w:val="false"/>
+          <w:caps w:val="false"/>
+          <w:smallCaps w:val="false"/>
+          <w:sz w:val="24"/>
+          <w:lang w:val="en-US"/>
+        </w:rPr>
+        <w:t xml:space="preserve">LoginEntry </w:t>
+      </w:r>
+      <w:r>
+        <w:rPr>
+          <w:rFonts w:ascii="Aptos;Aptos_EmbeddedFont;Aptos_MSFontService;sans-serif" w:hAnsi="Aptos;Aptos_EmbeddedFont;Aptos_MSFontService;sans-serif"/>
+          <w:b w:val="false"/>
+          <w:i w:val="false"/>
+          <w:caps w:val="false"/>
+          <w:smallCaps w:val="false"/>
+          <w:sz w:val="24"/>
+          <w:lang w:val="en-US"/>
+        </w:rPr>
+        <w:t xml:space="preserve">with </w:t>
+      </w:r>
+      <w:r>
+        <w:rPr>
+          <w:rFonts w:ascii="Aptos;Aptos_EmbeddedFont;Aptos_MSFontService;sans-serif" w:hAnsi="Aptos;Aptos_EmbeddedFont;Aptos_MSFontService;sans-serif"/>
+          <w:b/>
+          <w:i w:val="false"/>
+          <w:caps w:val="false"/>
+          <w:smallCaps w:val="false"/>
+          <w:sz w:val="24"/>
+          <w:lang w:val="en-US"/>
+        </w:rPr>
+        <w:t xml:space="preserve">TextLogin and TOTPLogin </w:t>
+      </w:r>
+      <w:r>
+        <w:rPr>
+          <w:rFonts w:ascii="Aptos;Aptos_EmbeddedFont;Aptos_MSFontService;sans-serif" w:hAnsi="Aptos;Aptos_EmbeddedFont;Aptos_MSFontService;sans-serif"/>
+          <w:b w:val="false"/>
+          <w:i w:val="false"/>
+          <w:caps w:val="false"/>
+          <w:smallCaps w:val="false"/>
+          <w:sz w:val="24"/>
+          <w:lang w:val="en-US"/>
+        </w:rPr>
+        <w:t xml:space="preserve">as subclasses. </w:t>
+      </w:r>
+      <w:r>
+        <w:rPr>
+          <w:rFonts w:ascii="Aptos;Aptos_EmbeddedFont;Aptos_MSFontService;sans-serif" w:hAnsi="Aptos;Aptos_EmbeddedFont;Aptos_MSFontService;sans-serif"/>
+          <w:b/>
+          <w:i w:val="false"/>
+          <w:caps w:val="false"/>
+          <w:smallCaps w:val="false"/>
+          <w:sz w:val="24"/>
+          <w:lang w:val="en-US"/>
+        </w:rPr>
+        <w:t>HMACUtil</w:t>
+      </w:r>
+      <w:r>
+        <w:rPr>
+          <w:b w:val="false"/>
+          <w:i w:val="false"/>
+          <w:caps w:val="false"/>
+          <w:smallCaps w:val="false"/>
+        </w:rPr>
+        <w:t xml:space="preserve"> </w:t>
+      </w:r>
+      <w:r>
+        <w:rPr>
+          <w:rFonts w:ascii="Aptos;Aptos_EmbeddedFont;Aptos_MSFontService;sans-serif" w:hAnsi="Aptos;Aptos_EmbeddedFont;Aptos_MSFontService;sans-serif"/>
+          <w:b w:val="false"/>
+          <w:i w:val="false"/>
+          <w:caps w:val="false"/>
+          <w:smallCaps w:val="false"/>
+          <w:sz w:val="24"/>
+          <w:lang w:val="en-US"/>
+        </w:rPr>
+        <w:t>for TOTP Calculation. </w:t>
+      </w:r>
+      <w:r>
+        <w:rPr>
+          <w:b w:val="false"/>
+          <w:i w:val="false"/>
+          <w:caps w:val="false"/>
+          <w:smallCaps w:val="false"/>
+        </w:rPr>
+        <w:t> </w:t>
+      </w:r>
+    </w:p>
+    <w:p>
+      <w:pPr>
+        <w:pStyle w:val="BodyText"/>
+        <w:pBdr/>
+        <w:spacing w:lineRule="auto" w:line="276" w:before="0" w:after="150"/>
+        <w:ind w:hanging="0" w:left="0" w:right="0"/>
         <w:jc w:val="both"/>
         <w:rPr>
-          <w:color w:themeColor="dark1" w:themeTint="80" w:val="7F7F7F"/>
-        </w:rPr>
-      </w:pPr>
-      <w:r>
-        <w:rPr>
-          <w:color w:themeColor="dark1" w:themeTint="80" w:val="7F7F7F"/>
-        </w:rPr>
-        <w:t xml:space="preserve">Write a brief description of your first solution and provide the reasons in terms of testing for not selecting this one. </w:t>
+          <w:rFonts w:ascii="Aptos;Aptos_EmbeddedFont;Aptos_MSFontService;sans-serif" w:hAnsi="Aptos;Aptos_EmbeddedFont;Aptos_MSFontService;sans-serif"/>
+          <w:sz w:val="24"/>
+          <w:lang w:val="en-US"/>
+        </w:rPr>
+      </w:pPr>
+      <w:r>
+        <w:rPr>
+          <w:b w:val="false"/>
+          <w:i w:val="false"/>
+          <w:caps w:val="false"/>
+          <w:smallCaps w:val="false"/>
+        </w:rPr>
+      </w:r>
+    </w:p>
+    <w:p>
+      <w:pPr>
+        <w:pStyle w:val="BodyText"/>
+        <w:pBdr/>
+        <w:spacing w:lineRule="auto" w:line="276" w:before="0" w:after="150"/>
+        <w:ind w:hanging="0" w:left="0" w:right="0"/>
+        <w:jc w:val="both"/>
+        <w:rPr>
+          <w:b w:val="false"/>
+          <w:i w:val="false"/>
+          <w:caps w:val="false"/>
+          <w:smallCaps w:val="false"/>
+        </w:rPr>
+      </w:pPr>
+      <w:r>
+        <w:rPr>
+          <w:rFonts w:ascii="Aptos;Aptos_EmbeddedFont;Aptos_MSFontService;sans-serif" w:hAnsi="Aptos;Aptos_EmbeddedFont;Aptos_MSFontService;sans-serif"/>
+          <w:b w:val="false"/>
+          <w:i w:val="false"/>
+          <w:caps w:val="false"/>
+          <w:smallCaps w:val="false"/>
+          <w:sz w:val="24"/>
+          <w:lang w:val="en-US"/>
+        </w:rPr>
+        <w:t xml:space="preserve">We did not select the design due to this testability. </w:t>
+      </w:r>
+      <w:r>
+        <w:rPr>
+          <w:rFonts w:ascii="Aptos;Aptos_EmbeddedFont;Aptos_MSFontService;sans-serif" w:hAnsi="Aptos;Aptos_EmbeddedFont;Aptos_MSFontService;sans-serif"/>
+          <w:b/>
+          <w:i w:val="false"/>
+          <w:caps w:val="false"/>
+          <w:smallCaps w:val="false"/>
+          <w:sz w:val="24"/>
+          <w:lang w:val="en-US"/>
+        </w:rPr>
+        <w:t xml:space="preserve">ProgramController </w:t>
+      </w:r>
+      <w:r>
+        <w:rPr>
+          <w:rFonts w:ascii="Aptos;Aptos_EmbeddedFont;Aptos_MSFontService;sans-serif" w:hAnsi="Aptos;Aptos_EmbeddedFont;Aptos_MSFontService;sans-serif"/>
+          <w:b w:val="false"/>
+          <w:i w:val="false"/>
+          <w:caps w:val="false"/>
+          <w:smallCaps w:val="false"/>
+          <w:sz w:val="24"/>
+          <w:lang w:val="en-US"/>
+        </w:rPr>
+        <w:t xml:space="preserve">has too many responsibilities including handling databases access, TOTP generation and entry management and authentication. </w:t>
+      </w:r>
+      <w:r>
+        <w:rPr>
+          <w:rFonts w:ascii="Aptos;Aptos_EmbeddedFont;Aptos_MSFontService;sans-serif" w:hAnsi="Aptos;Aptos_EmbeddedFont;Aptos_MSFontService;sans-serif"/>
+          <w:b/>
+          <w:i w:val="false"/>
+          <w:caps w:val="false"/>
+          <w:smallCaps w:val="false"/>
+          <w:sz w:val="24"/>
+          <w:lang w:val="en-US"/>
+        </w:rPr>
+        <w:t>LoginView</w:t>
+      </w:r>
+      <w:r>
+        <w:rPr>
+          <w:b w:val="false"/>
+          <w:i w:val="false"/>
+          <w:caps w:val="false"/>
+          <w:smallCaps w:val="false"/>
+        </w:rPr>
+        <w:t xml:space="preserve"> </w:t>
+      </w:r>
+      <w:r>
+        <w:rPr>
+          <w:rFonts w:ascii="Aptos;Aptos_EmbeddedFont;Aptos_MSFontService;sans-serif" w:hAnsi="Aptos;Aptos_EmbeddedFont;Aptos_MSFontService;sans-serif"/>
+          <w:b w:val="false"/>
+          <w:i w:val="false"/>
+          <w:caps w:val="false"/>
+          <w:smallCaps w:val="false"/>
+          <w:sz w:val="24"/>
+          <w:lang w:val="en-US"/>
+        </w:rPr>
+        <w:t>combines all the mainview, login entries and all kinds of user inputs cannot be tested alone. Testing any of them needs to be set up the other and it would be large and the testing is dependent on the other. The controller and the view depend on each other, and we couldn’t test the controller logic as there is no real interface.</w:t>
+      </w:r>
+      <w:r>
+        <w:rPr>
+          <w:b w:val="false"/>
+          <w:i w:val="false"/>
+          <w:caps w:val="false"/>
+          <w:smallCaps w:val="false"/>
+        </w:rPr>
+        <w:t> </w:t>
+      </w:r>
+    </w:p>
+    <w:p>
+      <w:pPr>
+        <w:pStyle w:val="Normal"/>
+        <w:ind w:hanging="0" w:left="0"/>
+        <w:jc w:val="left"/>
+        <w:rPr>
+          <w:color w:themeColor="dark1" w:val="000000"/>
+        </w:rPr>
+      </w:pPr>
+      <w:r>
+        <w:rPr/>
       </w:r>
     </w:p>
     <w:p>
@@ -2735,16 +3179,439 @@
     <w:p>
       <w:pPr>
         <w:pStyle w:val="Normal"/>
+        <w:ind w:hanging="0" w:left="0"/>
+        <w:jc w:val="left"/>
+        <w:rPr>
+          <w:color w:themeColor="dark1" w:val="000000"/>
+        </w:rPr>
+      </w:pPr>
+      <w:r>
+        <w:rPr/>
+      </w:r>
+    </w:p>
+    <w:p>
+      <w:pPr>
+        <w:pStyle w:val="Normal"/>
+        <w:ind w:hanging="0" w:left="0"/>
+        <w:jc w:val="left"/>
+        <w:rPr>
+          <w:color w:themeColor="dark1" w:val="000000"/>
+        </w:rPr>
+      </w:pPr>
+      <w:r>
+        <w:rPr/>
+        <w:drawing>
+          <wp:anchor behindDoc="0" distT="0" distB="0" distL="0" distR="0" simplePos="0" locked="0" layoutInCell="0" allowOverlap="1" relativeHeight="4">
+            <wp:simplePos x="0" y="0"/>
+            <wp:positionH relativeFrom="column">
+              <wp:align>center</wp:align>
+            </wp:positionH>
+            <wp:positionV relativeFrom="paragraph">
+              <wp:posOffset>635</wp:posOffset>
+            </wp:positionV>
+            <wp:extent cx="5943600" cy="2769235"/>
+            <wp:effectExtent l="0" t="0" r="0" b="0"/>
+            <wp:wrapSquare wrapText="largest"/>
+            <wp:docPr id="3" name="Image2" descr=""/>
+            <wp:cNvGraphicFramePr>
+              <a:graphicFrameLocks xmlns:a="http://schemas.openxmlformats.org/drawingml/2006/main" noChangeAspect="1"/>
+            </wp:cNvGraphicFramePr>
+            <a:graphic xmlns:a="http://schemas.openxmlformats.org/drawingml/2006/main">
+              <a:graphicData uri="http://schemas.openxmlformats.org/drawingml/2006/picture">
+                <pic:pic xmlns:pic="http://schemas.openxmlformats.org/drawingml/2006/picture">
+                  <pic:nvPicPr>
+                    <pic:cNvPr id="3" name="Image2" descr=""/>
+                    <pic:cNvPicPr>
+                      <a:picLocks noChangeAspect="1" noChangeArrowheads="1"/>
+                    </pic:cNvPicPr>
+                  </pic:nvPicPr>
+                  <pic:blipFill>
+                    <a:blip r:embed="rId4"/>
+                    <a:stretch>
+                      <a:fillRect/>
+                    </a:stretch>
+                  </pic:blipFill>
+                  <pic:spPr bwMode="auto">
+                    <a:xfrm>
+                      <a:off x="0" y="0"/>
+                      <a:ext cx="5943600" cy="2769235"/>
+                    </a:xfrm>
+                    <a:prstGeom prst="rect">
+                      <a:avLst/>
+                    </a:prstGeom>
+                  </pic:spPr>
+                </pic:pic>
+              </a:graphicData>
+            </a:graphic>
+          </wp:anchor>
+        </w:drawing>
+      </w:r>
+    </w:p>
+    <w:p>
+      <w:pPr>
+        <w:pStyle w:val="BodyText"/>
+        <w:spacing w:lineRule="auto" w:line="276"/>
+        <w:ind w:hanging="0" w:left="0"/>
+        <w:jc w:val="left"/>
+        <w:rPr>
+          <w:b w:val="false"/>
+          <w:i w:val="false"/>
+          <w:caps w:val="false"/>
+          <w:smallCaps w:val="false"/>
+        </w:rPr>
+      </w:pPr>
+      <w:r>
+        <w:rPr>
+          <w:rFonts w:ascii="Aptos;Aptos_EmbeddedFont;Aptos_MSFontService;sans-serif" w:hAnsi="Aptos;Aptos_EmbeddedFont;Aptos_MSFontService;sans-serif"/>
+          <w:b w:val="false"/>
+          <w:i w:val="false"/>
+          <w:caps w:val="false"/>
+          <w:smallCaps w:val="false"/>
+          <w:sz w:val="24"/>
+          <w:lang w:val="en-US"/>
+        </w:rPr>
+        <w:t xml:space="preserve">Our solution 2 is the improved solution of Solution 1. It was also designed based on the MVP architecture. Here the </w:t>
+      </w:r>
+      <w:r>
+        <w:rPr>
+          <w:rFonts w:ascii="Aptos;Aptos_EmbeddedFont;Aptos_MSFontService;sans-serif" w:hAnsi="Aptos;Aptos_EmbeddedFont;Aptos_MSFontService;sans-serif"/>
+          <w:b/>
+          <w:i w:val="false"/>
+          <w:caps w:val="false"/>
+          <w:smallCaps w:val="false"/>
+          <w:sz w:val="24"/>
+          <w:lang w:val="en-US"/>
+        </w:rPr>
+        <w:t xml:space="preserve">View </w:t>
+      </w:r>
+      <w:r>
+        <w:rPr>
+          <w:rFonts w:ascii="Aptos;Aptos_EmbeddedFont;Aptos_MSFontService;sans-serif" w:hAnsi="Aptos;Aptos_EmbeddedFont;Aptos_MSFontService;sans-serif"/>
+          <w:b w:val="false"/>
+          <w:i w:val="false"/>
+          <w:caps w:val="false"/>
+          <w:smallCaps w:val="false"/>
+          <w:sz w:val="24"/>
+          <w:lang w:val="en-US"/>
+        </w:rPr>
+        <w:t xml:space="preserve">is split into four classes: </w:t>
+      </w:r>
+      <w:r>
+        <w:rPr>
+          <w:rFonts w:ascii="Aptos;Aptos_EmbeddedFont;Aptos_MSFontService;sans-serif" w:hAnsi="Aptos;Aptos_EmbeddedFont;Aptos_MSFontService;sans-serif"/>
+          <w:b/>
+          <w:i w:val="false"/>
+          <w:caps w:val="false"/>
+          <w:smallCaps w:val="false"/>
+          <w:sz w:val="24"/>
+          <w:lang w:val="en-US"/>
+        </w:rPr>
+        <w:t>ProgramView, AuthView, ListView, EntryView</w:t>
+      </w:r>
+      <w:r>
+        <w:rPr>
+          <w:rFonts w:ascii="Aptos;Aptos_EmbeddedFont;Aptos_MSFontService;sans-serif" w:hAnsi="Aptos;Aptos_EmbeddedFont;Aptos_MSFontService;sans-serif"/>
+          <w:b w:val="false"/>
+          <w:i w:val="false"/>
+          <w:caps w:val="false"/>
+          <w:smallCaps w:val="false"/>
+          <w:sz w:val="24"/>
+          <w:lang w:val="en-US"/>
+        </w:rPr>
+        <w:t xml:space="preserve">. Each of them handles every part of the user flow which includes Initiating the application, authenticating it, Listing and Editing the entries. Each of them refers to the </w:t>
+      </w:r>
+      <w:r>
+        <w:rPr>
+          <w:rFonts w:ascii="Aptos;Aptos_EmbeddedFont;Aptos_MSFontService;sans-serif" w:hAnsi="Aptos;Aptos_EmbeddedFont;Aptos_MSFontService;sans-serif"/>
+          <w:b/>
+          <w:i w:val="false"/>
+          <w:caps w:val="false"/>
+          <w:smallCaps w:val="false"/>
+          <w:sz w:val="24"/>
+          <w:lang w:val="en-US"/>
+        </w:rPr>
+        <w:t>ProgramPresenter</w:t>
+      </w:r>
+      <w:r>
+        <w:rPr>
+          <w:rFonts w:ascii="Aptos;Aptos_EmbeddedFont;Aptos_MSFontService;sans-serif" w:hAnsi="Aptos;Aptos_EmbeddedFont;Aptos_MSFontService;sans-serif"/>
+          <w:b w:val="false"/>
+          <w:i w:val="false"/>
+          <w:caps w:val="false"/>
+          <w:smallCaps w:val="false"/>
+          <w:sz w:val="24"/>
+          <w:lang w:val="en-US"/>
+        </w:rPr>
+        <w:t xml:space="preserve">, which includes initializing the database, editing, saving and reading login data, create and edit logins and requesting and generating TOTPs. </w:t>
+      </w:r>
+      <w:r>
+        <w:rPr>
+          <w:rFonts w:ascii="Aptos;Aptos_EmbeddedFont;Aptos_MSFontService;sans-serif" w:hAnsi="Aptos;Aptos_EmbeddedFont;Aptos_MSFontService;sans-serif"/>
+          <w:b/>
+          <w:i w:val="false"/>
+          <w:caps w:val="false"/>
+          <w:smallCaps w:val="false"/>
+          <w:sz w:val="24"/>
+          <w:lang w:val="en-US"/>
+        </w:rPr>
+        <w:t>HMACUtil </w:t>
+      </w:r>
+      <w:r>
+        <w:rPr>
+          <w:rFonts w:ascii="Aptos;Aptos_EmbeddedFont;Aptos_MSFontService;sans-serif" w:hAnsi="Aptos;Aptos_EmbeddedFont;Aptos_MSFontService;sans-serif"/>
+          <w:b w:val="false"/>
+          <w:bCs w:val="false"/>
+          <w:i w:val="false"/>
+          <w:caps w:val="false"/>
+          <w:smallCaps w:val="false"/>
+          <w:sz w:val="24"/>
+          <w:lang w:val="en-US"/>
+        </w:rPr>
+        <w:t xml:space="preserve">was moved from the </w:t>
+      </w:r>
+      <w:r>
+        <w:rPr>
+          <w:rFonts w:ascii="Aptos;Aptos_EmbeddedFont;Aptos_MSFontService;sans-serif" w:hAnsi="Aptos;Aptos_EmbeddedFont;Aptos_MSFontService;sans-serif"/>
+          <w:b/>
+          <w:bCs/>
+          <w:i w:val="false"/>
+          <w:caps w:val="false"/>
+          <w:smallCaps w:val="false"/>
+          <w:sz w:val="24"/>
+          <w:lang w:val="en-US"/>
+        </w:rPr>
+        <w:t>TOTPLogin</w:t>
+      </w:r>
+      <w:r>
+        <w:rPr>
+          <w:rFonts w:ascii="Aptos;Aptos_EmbeddedFont;Aptos_MSFontService;sans-serif" w:hAnsi="Aptos;Aptos_EmbeddedFont;Aptos_MSFontService;sans-serif"/>
+          <w:b w:val="false"/>
+          <w:bCs w:val="false"/>
+          <w:i w:val="false"/>
+          <w:caps w:val="false"/>
+          <w:smallCaps w:val="false"/>
+          <w:sz w:val="24"/>
+          <w:lang w:val="en-US"/>
+        </w:rPr>
+        <w:t xml:space="preserve"> class to the Presenter class to put additional responsibility on the </w:t>
+      </w:r>
+      <w:r>
+        <w:rPr>
+          <w:rFonts w:ascii="Aptos;Aptos_EmbeddedFont;Aptos_MSFontService;sans-serif" w:hAnsi="Aptos;Aptos_EmbeddedFont;Aptos_MSFontService;sans-serif"/>
+          <w:b/>
+          <w:bCs/>
+          <w:i w:val="false"/>
+          <w:caps w:val="false"/>
+          <w:smallCaps w:val="false"/>
+          <w:sz w:val="24"/>
+          <w:lang w:val="en-US"/>
+        </w:rPr>
+        <w:t>ProgramPresenter</w:t>
+      </w:r>
+      <w:r>
+        <w:rPr>
+          <w:rFonts w:ascii="Aptos;Aptos_EmbeddedFont;Aptos_MSFontService;sans-serif" w:hAnsi="Aptos;Aptos_EmbeddedFont;Aptos_MSFontService;sans-serif"/>
+          <w:b w:val="false"/>
+          <w:bCs w:val="false"/>
+          <w:i w:val="false"/>
+          <w:caps w:val="false"/>
+          <w:smallCaps w:val="false"/>
+          <w:sz w:val="24"/>
+          <w:lang w:val="en-US"/>
+        </w:rPr>
+        <w:t xml:space="preserve"> for translating data structures between the model and the view, and to reduce having unencrypted data stored in memory for extended periods of time. Only the </w:t>
+      </w:r>
+      <w:r>
+        <w:rPr>
+          <w:rFonts w:ascii="Aptos;Aptos_EmbeddedFont;Aptos_MSFontService;sans-serif" w:hAnsi="Aptos;Aptos_EmbeddedFont;Aptos_MSFontService;sans-serif"/>
+          <w:b/>
+          <w:bCs/>
+          <w:i w:val="false"/>
+          <w:caps w:val="false"/>
+          <w:smallCaps w:val="false"/>
+          <w:sz w:val="24"/>
+          <w:lang w:val="en-US"/>
+        </w:rPr>
+        <w:t>ProgramPresenter</w:t>
+      </w:r>
+      <w:r>
+        <w:rPr>
+          <w:rFonts w:ascii="Aptos;Aptos_EmbeddedFont;Aptos_MSFontService;sans-serif" w:hAnsi="Aptos;Aptos_EmbeddedFont;Aptos_MSFontService;sans-serif"/>
+          <w:b w:val="false"/>
+          <w:bCs w:val="false"/>
+          <w:i w:val="false"/>
+          <w:caps w:val="false"/>
+          <w:smallCaps w:val="false"/>
+          <w:sz w:val="24"/>
+          <w:lang w:val="en-US"/>
+        </w:rPr>
+        <w:t xml:space="preserve"> communicates with the </w:t>
+      </w:r>
+      <w:r>
+        <w:rPr>
+          <w:rFonts w:ascii="Aptos;Aptos_EmbeddedFont;Aptos_MSFontService;sans-serif" w:hAnsi="Aptos;Aptos_EmbeddedFont;Aptos_MSFontService;sans-serif"/>
+          <w:b/>
+          <w:i w:val="false"/>
+          <w:caps w:val="false"/>
+          <w:smallCaps w:val="false"/>
+          <w:sz w:val="24"/>
+          <w:lang w:val="en-US"/>
+        </w:rPr>
+        <w:t xml:space="preserve">DatabaseManager, HMACUtil, PrimaryKey </w:t>
+      </w:r>
+      <w:r>
+        <w:rPr>
+          <w:rFonts w:ascii="Aptos;Aptos_EmbeddedFont;Aptos_MSFontService;sans-serif" w:hAnsi="Aptos;Aptos_EmbeddedFont;Aptos_MSFontService;sans-serif"/>
+          <w:b w:val="false"/>
+          <w:i w:val="false"/>
+          <w:caps w:val="false"/>
+          <w:smallCaps w:val="false"/>
+          <w:sz w:val="24"/>
+          <w:lang w:val="en-US"/>
+        </w:rPr>
+        <w:t xml:space="preserve">and </w:t>
+      </w:r>
+      <w:r>
+        <w:rPr>
+          <w:rFonts w:ascii="Aptos;Aptos_EmbeddedFont;Aptos_MSFontService;sans-serif" w:hAnsi="Aptos;Aptos_EmbeddedFont;Aptos_MSFontService;sans-serif"/>
+          <w:b/>
+          <w:i w:val="false"/>
+          <w:caps w:val="false"/>
+          <w:smallCaps w:val="false"/>
+          <w:sz w:val="24"/>
+          <w:lang w:val="en-US"/>
+        </w:rPr>
+        <w:t xml:space="preserve">LoginEntry </w:t>
+      </w:r>
+      <w:r>
+        <w:rPr>
+          <w:rFonts w:ascii="Aptos;Aptos_EmbeddedFont;Aptos_MSFontService;sans-serif" w:hAnsi="Aptos;Aptos_EmbeddedFont;Aptos_MSFontService;sans-serif"/>
+          <w:b w:val="false"/>
+          <w:i w:val="false"/>
+          <w:caps w:val="false"/>
+          <w:smallCaps w:val="false"/>
+          <w:sz w:val="24"/>
+          <w:lang w:val="en-US"/>
+        </w:rPr>
+        <w:t>classes.</w:t>
+      </w:r>
+    </w:p>
+    <w:p>
+      <w:pPr>
+        <w:pStyle w:val="BodyText"/>
+        <w:spacing w:lineRule="auto" w:line="276"/>
+        <w:ind w:hanging="0" w:left="0"/>
+        <w:jc w:val="left"/>
+        <w:rPr>
+          <w:rFonts w:ascii="Aptos;Aptos_EmbeddedFont;Aptos_MSFontService;sans-serif" w:hAnsi="Aptos;Aptos_EmbeddedFont;Aptos_MSFontService;sans-serif"/>
+          <w:sz w:val="24"/>
+          <w:lang w:val="en-US"/>
+        </w:rPr>
+      </w:pPr>
+      <w:r>
+        <w:rPr>
+          <w:b w:val="false"/>
+          <w:i w:val="false"/>
+          <w:caps w:val="false"/>
+          <w:smallCaps w:val="false"/>
+        </w:rPr>
+      </w:r>
+    </w:p>
+    <w:p>
+      <w:pPr>
+        <w:pStyle w:val="BodyText"/>
+        <w:pBdr/>
+        <w:spacing w:lineRule="auto" w:line="276" w:before="0" w:after="150"/>
+        <w:ind w:hanging="0" w:left="0" w:right="0"/>
         <w:jc w:val="both"/>
         <w:rPr>
-          <w:color w:themeColor="dark1" w:themeTint="80" w:val="7F7F7F"/>
-        </w:rPr>
-      </w:pPr>
-      <w:r>
-        <w:rPr>
-          <w:color w:themeColor="dark1" w:themeTint="80" w:val="7F7F7F"/>
-        </w:rPr>
-        <w:t xml:space="preserve">This is an improved solution but might not be the final solution that you select. Give a brief description of this solution here. Again focus on its testing attributes. </w:t>
+          <w:b w:val="false"/>
+          <w:i w:val="false"/>
+          <w:caps w:val="false"/>
+          <w:smallCaps w:val="false"/>
+        </w:rPr>
+      </w:pPr>
+      <w:r>
+        <w:rPr>
+          <w:rFonts w:ascii="Aptos;Aptos_EmbeddedFont;Aptos_MSFontService;sans-serif" w:hAnsi="Aptos;Aptos_EmbeddedFont;Aptos_MSFontService;sans-serif"/>
+          <w:b w:val="false"/>
+          <w:i w:val="false"/>
+          <w:caps w:val="false"/>
+          <w:smallCaps w:val="false"/>
+          <w:sz w:val="24"/>
+          <w:lang w:val="en-US"/>
+        </w:rPr>
+        <w:t xml:space="preserve">This design can be easily tested for various reasons, such as all the Views can be tested with a mock presenter. Each view is small, so it can be checked alone to confirm whether it calls the right presenter method. All the components must be tested independently. </w:t>
+      </w:r>
+      <w:r>
+        <w:rPr>
+          <w:rFonts w:ascii="Aptos;Aptos_EmbeddedFont;Aptos_MSFontService;sans-serif" w:hAnsi="Aptos;Aptos_EmbeddedFont;Aptos_MSFontService;sans-serif"/>
+          <w:b/>
+          <w:i w:val="false"/>
+          <w:caps w:val="false"/>
+          <w:smallCaps w:val="false"/>
+          <w:sz w:val="24"/>
+          <w:lang w:val="en-US"/>
+        </w:rPr>
+        <w:t xml:space="preserve">Primary Key </w:t>
+      </w:r>
+      <w:r>
+        <w:rPr>
+          <w:rFonts w:ascii="Aptos;Aptos_EmbeddedFont;Aptos_MSFontService;sans-serif" w:hAnsi="Aptos;Aptos_EmbeddedFont;Aptos_MSFontService;sans-serif"/>
+          <w:b w:val="false"/>
+          <w:i w:val="false"/>
+          <w:caps w:val="false"/>
+          <w:smallCaps w:val="false"/>
+          <w:sz w:val="24"/>
+          <w:lang w:val="en-US"/>
+        </w:rPr>
+        <w:t xml:space="preserve">can be checked by encrypting and decrypting the known strings. </w:t>
+      </w:r>
+      <w:r>
+        <w:rPr>
+          <w:rFonts w:ascii="Aptos;Aptos_EmbeddedFont;Aptos_MSFontService;sans-serif" w:hAnsi="Aptos;Aptos_EmbeddedFont;Aptos_MSFontService;sans-serif"/>
+          <w:b/>
+          <w:i w:val="false"/>
+          <w:caps w:val="false"/>
+          <w:smallCaps w:val="false"/>
+          <w:sz w:val="24"/>
+          <w:lang w:val="en-US"/>
+        </w:rPr>
+        <w:t xml:space="preserve">HMACUtil </w:t>
+      </w:r>
+      <w:r>
+        <w:rPr>
+          <w:rFonts w:ascii="Aptos;Aptos_EmbeddedFont;Aptos_MSFontService;sans-serif" w:hAnsi="Aptos;Aptos_EmbeddedFont;Aptos_MSFontService;sans-serif"/>
+          <w:b w:val="false"/>
+          <w:i w:val="false"/>
+          <w:caps w:val="false"/>
+          <w:smallCaps w:val="false"/>
+          <w:sz w:val="24"/>
+          <w:lang w:val="en-US"/>
+        </w:rPr>
+        <w:t>function can be tested and verified by known TOTP test vectors. Presenter logic can be tested without any UI. The presenter never handles any input or output directly and can be tested by function calling methods. The user input is also isolated and it is easy to test. All these properties let us test each component by itself before even implementing them, So, it seems to be a better and improved version of Solution 1.</w:t>
+      </w:r>
+      <w:r>
+        <w:rPr>
+          <w:b w:val="false"/>
+          <w:i w:val="false"/>
+          <w:caps w:val="false"/>
+          <w:smallCaps w:val="false"/>
+        </w:rPr>
+        <w:t> </w:t>
+      </w:r>
+    </w:p>
+    <w:p>
+      <w:pPr>
+        <w:pStyle w:val="Normal"/>
+        <w:ind w:hanging="0" w:left="0"/>
+        <w:jc w:val="left"/>
+        <w:rPr>
+          <w:color w:themeColor="dark1" w:val="000000"/>
+        </w:rPr>
+      </w:pPr>
+      <w:r>
+        <w:rPr/>
       </w:r>
     </w:p>
     <w:p>
@@ -5251,12 +6118,12 @@
       </w:r>
     </w:p>
     <w:sectPr>
-      <w:headerReference w:type="even" r:id="rId3"/>
-      <w:headerReference w:type="default" r:id="rId4"/>
-      <w:headerReference w:type="first" r:id="rId5"/>
-      <w:footerReference w:type="even" r:id="rId6"/>
-      <w:footerReference w:type="default" r:id="rId7"/>
-      <w:footerReference w:type="first" r:id="rId8"/>
+      <w:headerReference w:type="even" r:id="rId5"/>
+      <w:headerReference w:type="default" r:id="rId6"/>
+      <w:headerReference w:type="first" r:id="rId7"/>
+      <w:footerReference w:type="even" r:id="rId8"/>
+      <w:footerReference w:type="default" r:id="rId9"/>
+      <w:footerReference w:type="first" r:id="rId10"/>
       <w:type w:val="nextPage"/>
       <w:pgSz w:w="12240" w:h="15840"/>
       <w:pgMar w:left="1440" w:right="1440" w:gutter="0" w:header="708" w:top="1440" w:footer="708" w:bottom="1440"/>
@@ -5306,7 +6173,7 @@
     </w:r>
     <w:r>
       <w:rPr/>
-      <w:t>2026-09-23</w:t>
+      <w:t>2026-10-08</w:t>
     </w:r>
     <w:r>
       <w:rPr/>
@@ -5331,7 +6198,7 @@
     </w:r>
     <w:r>
       <w:rPr/>
-      <w:t>18</w:t>
+      <w:t>20</w:t>
     </w:r>
     <w:r>
       <w:rPr/>
@@ -7080,7 +7947,7 @@
     <w:pPr>
       <w:widowControl/>
       <w:suppressAutoHyphens w:val="true"/>
-      <w:overflowPunct w:val="true"/>
+      <w:overflowPunct w:val="false"/>
       <w:bidi w:val="0"/>
       <w:spacing w:lineRule="auto" w:line="259" w:before="0" w:after="160"/>
       <w:jc w:val="left"/>
@@ -7584,7 +8451,7 @@
     <w:pPr>
       <w:widowControl/>
       <w:suppressAutoHyphens w:val="true"/>
-      <w:overflowPunct w:val="true"/>
+      <w:overflowPunct w:val="false"/>
       <w:bidi w:val="0"/>
       <w:spacing w:lineRule="auto" w:line="276" w:before="0" w:after="0"/>
       <w:jc w:val="left"/>
@@ -7813,7 +8680,7 @@
     <w:pPr>
       <w:widowControl/>
       <w:suppressAutoHyphens w:val="true"/>
-      <w:overflowPunct w:val="true"/>
+      <w:overflowPunct w:val="false"/>
       <w:bidi w:val="0"/>
       <w:spacing w:lineRule="auto" w:line="240" w:before="0" w:after="0"/>
       <w:jc w:val="left"/>

</xml_diff>